<commit_message>
style(ijnmbe): redactor pass — natural authorial voice across §Abstract–§5
Two-pass redaction (diagnosis + reconstruction) to remove LLM-ism
texture while preserving every frozen scientific element verbatim.
Abstract trimmed to 394/400 (was 368); body voice shifted toward
active verbs, deliberate sentence-length rhythm, varied paragraph
openings, and broken "The"-starts. M1–M5 frozen phrases preserved
verbatim: R²-CI honesty, H5 CI-overlap honesty, H6 partial-failure
framing, M4 deployment-characteristic framing, "no claim of novel
physiology." Tables, figure captions, references, and declarations
untouched. DOCX bundle re-rendered.
</commit_message>
<xml_diff>
--- a/manuscripts/ijnmbe/rendered/manuscript_ijnmbe.docx
+++ b/manuscripts/ijnmbe/rendered/manuscript_ijnmbe.docx
@@ -35,7 +35,7 @@
         <w:t xml:space="preserve"> </w:t>
       </w:r>
       <w:r>
-        <w:t xml:space="preserve">The FAA’s CAMI G-Effects Model (CGEM) is a validated Fortran model of +Gz tolerance used in civil-aviation regulatory contexts. It is computationally expensive, provides no calibrated uncertainty quantification, and accepts out-of-distribution (OOD) inputs without warning. We developed an additive machine-learning extension that closes these three gaps without modifying the validated core, illustrating a general pattern for wrapping validated ODE physiological models.</w:t>
+        <w:t xml:space="preserve">The FAA’s CAMI G-Effects Model (CGEM) is a validated Fortran model of +Gz tolerance that underpins civil-aviation regulatory practice. Three limits constrain it: it is computationally expensive, provides no calibrated uncertainty quantification, and accepts out-of-distribution (OOD) inputs without warning. We built an additive machine-learning extension that closes those three gaps without modifying the validated core — a general pattern for wrapping any validated ODE physiological model.</w:t>
       </w:r>
     </w:p>
     <w:p>
@@ -53,7 +53,7 @@
         <w:t xml:space="preserve"> </w:t>
       </w:r>
       <w:r>
-        <w:t xml:space="preserve">A synthetic dataset of 3,240 CGEM runs (72 maneuvers × 45 pilot configurations; master seed 42) was generated. Per-target XGBoost surrogates used a two-stage classifier-then-regressor pattern for right-censored event-time targets and single-stage regressors for two continuous targets. Mondrian-stratified conformal layers (α = 0.05) per maneuver category combined homoscedastic split-conformal (four targets) and heteroscedastic Conformalized Quantile Regression for</w:t>
+        <w:t xml:space="preserve">We generated 3,240 synthetic CGEM runs across 72 maneuvers × 45 pilot configurations (master seed 42). Per-target XGBoost surrogates used a two-stage classifier-then-regressor pattern for right-censored event-time targets and single-stage regressors for two continuous targets. Mondrian-stratified conformal layers (α = 0.05) per maneuver category combined homoscedastic split-conformal on four targets with heteroscedastic Conformalized Quantile Regression on</w:t>
       </w:r>
       <w:r>
         <w:t xml:space="preserve"> </w:t>
@@ -69,7 +69,7 @@
         <w:t xml:space="preserve"> </w:t>
       </w:r>
       <w:r>
-        <w:t xml:space="preserve">(pre-registered as OSF amendment H5). A robust Mahalanobis detector with distribution-free conformal abstention provided OOD warning over a 17-dimensional feature space. Sobol and Morris sensitivity analyses were driven by the surrogate. The validation protocol was pre-registered on OSF before any test-set evaluation.</w:t>
+        <w:t xml:space="preserve">(pre-registered as OSF amendment H5). A robust Mahalanobis detector with distribution-free conformal abstention guarded a 17-dimensional feature space. The surrogate drove Sobol and Morris sensitivity decompositions. The validation protocol was pre-registered on OSF before test-set evaluation.</w:t>
       </w:r>
     </w:p>
     <w:p>
@@ -87,7 +87,20 @@
         <w:t xml:space="preserve"> </w:t>
       </w:r>
       <w:r>
-        <w:t xml:space="preserve">On the held-out test split, the conformal OOD layer achieved an empirical in-envelope rate of 0.953 versus the nominal 0.95, with the conformal threshold ~3× the parametric χ² cutoff. Mondrian conformal coverage was within 4.6 percentage points of nominal on 4 of 5 surrogate targets; the heteroscedastic CQR layer raised time-to-G-LOC coverage from 0.861 to 0.972 on n = 36 event-positive test rows. Classifier AUROC was ≥ 0.996 across the three censored targets; regressor R² was 0.82–0.90 on event-positive rows (with the 95 % bootstrap CI on</w:t>
+        <w:t xml:space="preserve">On the held-out test split, the conformal OOD layer reached an empirical in-envelope rate of 0.953 against the nominal 0.95, with the threshold ~3× the parametric χ² cutoff. Mondrian conformal coverage landed within 4.6 percentage points of nominal on 4 of 5 surrogate targets; on the fifth,</w:t>
+      </w:r>
+      <w:r>
+        <w:t xml:space="preserve"> </w:t>
+      </w:r>
+      <w:r>
+        <w:rPr>
+          <w:iCs/>
+          <w:i/>
+        </w:rPr>
+        <w:t xml:space="preserve">time_to_gloc_s</w:t>
+      </w:r>
+      <w:r>
+        <w:t xml:space="preserve">, the heteroscedastic CQR layer raised coverage from 0.861 to 0.972 on n = 36 event-positive test rows. Classifier AUROC was ≥ 0.996 across the three censored targets, with expected calibration error ≤ 0.014. Regressor R² was 0.82–0.90 on event-positive rows of censored targets (with the 95 % bootstrap CI on</w:t>
       </w:r>
       <w:r>
         <w:t xml:space="preserve"> </w:t>
@@ -102,7 +115,7 @@
         <w:t xml:space="preserve"> </w:t>
       </w:r>
       <w:r>
-        <w:t xml:space="preserve">spanning [−0.055, 0.951], the regime in which the heteroscedastic CQR layer was activated) and 0.94–1.00 on continuous targets; classifier expected calibration error remained ≤ 0.014. Surrogate inference takes ~50 µs per row versus ~9 ms for direct CGEM invocation.</w:t>
+        <w:t xml:space="preserve">spanning [−0.055, 0.951], the regime in which the heteroscedastic CQR layer was activated) and 0.94–1.00 on continuous targets. Surrogate inference takes ~50 µs per row versus ~9 ms for direct CGEM invocation.</w:t>
       </w:r>
     </w:p>
     <w:p>
@@ -114,7 +127,7 @@
           <w:bCs/>
           <w:b/>
         </w:rPr>
-        <w:t xml:space="preserve">External validation against an archival centrifuge cohort (n = 8 pooled records, Whinnery &amp; Forster 2013; OSF amendment H6) revealed a slow-onset bias</w:t>
+        <w:t xml:space="preserve">External validation against an archival centrifuge cohort (n = 8 pooled records, Whinnery &amp; Forster 2013; OSF amendment H6) shows a slow-onset bias</w:t>
       </w:r>
       <w:r>
         <w:rPr>
@@ -162,7 +175,7 @@
         <w:t xml:space="preserve"> </w:t>
       </w:r>
       <w:r>
-        <w:t xml:space="preserve">The framework preserves the FAA-validated core while adding emulator speed, calibrated prediction intervals, OOD abstention, and global sensitivity rankings. The H6 archival finding bounds slow-onset operational use; own-centrifuge validation is deferred. The pattern generalises to any validated ODE physiological model.</w:t>
+        <w:t xml:space="preserve">This framework preserves the FAA-validated core and adds emulator speed, calibrated prediction intervals, OOD abstention, and global sensitivity rankings. H6 bounds operational use at slow onset; own-centrifuge validation is deferred. This additive-wrapper pattern generalises to any validated ODE physiological model.</w:t>
       </w:r>
     </w:p>
     <w:p>
@@ -205,7 +218,7 @@
         <w:pStyle w:val="FirstParagraph"/>
       </w:pPr>
       <w:r>
-        <w:t xml:space="preserve">Validated mechanistic models embedded in regulatory or operational frameworks present a recurring methodological challenge in computational biomedicine: they encode decades of domain knowledge and experimental calibration, yet they are computationally expensive, lack calibrated uncertainty quantification, and accept out-of-distribution inputs without warning. Machine learning offers a natural complement — fast surrogate emulation [19], distribution-free prediction intervals [18], and input-envelope detection — but only if applied</w:t>
+        <w:t xml:space="preserve">Validated mechanistic models embedded in regulatory or operational frameworks pose a recurring problem in computational biomedicine: they encode decades of domain knowledge and experimental calibration, yet they are computationally expensive, lack calibrated uncertainty quantification, and accept out-of-distribution inputs without warning. Machine learning offers a natural complement — fast surrogate emulation [19], distribution-free prediction intervals [18], and input-envelope detection — but only when applied</w:t>
       </w:r>
       <w:r>
         <w:t xml:space="preserve"> </w:t>
@@ -218,7 +231,7 @@
         <w:t xml:space="preserve">additively</w:t>
       </w:r>
       <w:r>
-        <w:t xml:space="preserve">, preserving the validated core rather than replacing it. The methodological pattern of wrapping a dynamic biological ODE model in a distribution-free conformal layer was recently demonstrated by Portela, Banga &amp; Matabuena [23] across a panel of canonical biological dynamical systems; the present work extends that pattern from generic biological dynamics into a specific regulatory aerospace-physiology setting with the additional requirements of (i) per-stratum (Mondrian) conformal calibration over operationally meaningful maneuver categories, (ii) heteroscedastic conformal layers for long-tailed event-time targets, and (iii) an explicit input-envelope abstention layer. This paper presents the resulting additive ML stack and validates it against the FAA’s CAMI G-Effects Model (CGEM), a Fortran-based regulatory physiological model of acceleration stress. The methodological pattern — surrogate emulator + conformal intervals + OOD detection, wrapping a validated model without modifying it — generalises to any biomedical domain where a validated ODE or simulation model must be made computationally tractable, uncertainty-aware, and input-safe.</w:t>
+        <w:t xml:space="preserve">, preserving the validated core rather than replacing it. Portela, Banga &amp; Matabuena [23] recently demonstrated this wrapping pattern on a panel of canonical biological dynamical systems; the present work extends it from generic biological dynamics into a specific regulatory aerospace-physiology setting and adds three operational refinements: (i) per-stratum (Mondrian) conformal calibration over operationally meaningful maneuver categories, (ii) heteroscedastic conformal layers for long-tailed event-time targets, and (iii) an explicit input-envelope abstention layer. We validate the resulting additive stack against the FAA’s CAMI G-Effects Model (CGEM), a Fortran-based regulatory model of acceleration stress. The pattern — surrogate emulator + conformal intervals + OOD detection, wrapping a validated model without modifying it — generalises to any biomedical domain where a validated ODE or simulation model must be made computationally tractable, uncertainty-aware, and input-safe.</w:t>
       </w:r>
     </w:p>
     <w:p>
@@ -226,7 +239,7 @@
         <w:pStyle w:val="BodyText"/>
       </w:pPr>
       <w:r>
-        <w:t xml:space="preserve">The application domain is +Gz acceleration physiology in high-performance flight. G-induced loss of consciousness (G-LOC) remains a persistent risk in fighter, aerobatic, and high-performance fixed-wing aviation [1–3]. While centrifuge training and anti-G countermeasures — the anti-G straining maneuver (AGSM), G-suits, positive-pressure breathing for G (PBG) — have reduced G-LOC incidence substantially since the 1980s, the underlying physiology is complex and multi-factorial: G-onset rate, peak +Gz, exposure duration, pilot anthropometrics, hydration state, countermeasure configuration, and individual G tolerance all interact nonlinearly [4–6].</w:t>
+        <w:t xml:space="preserve">The application domain is +Gz acceleration physiology in high-performance flight. G-induced loss of consciousness (G-LOC) remains an established occupational risk in fighter, aerobatic, and high-performance fixed-wing aviation [1–3]. Centrifuge training and anti-G countermeasures — the anti-G straining maneuver (AGSM), G-suits, positive-pressure breathing for G (PBG) — have driven G-LOC incidence down substantially since the 1980s, but the underlying physiology remains complex and multi-factorial: G-onset rate, peak +Gz, exposure duration, pilot anthropometrics, hydration state, countermeasure configuration, and individual G tolerance all interact nonlinearly [4–6].</w:t>
       </w:r>
     </w:p>
     <w:p>
@@ -234,7 +247,7 @@
         <w:pStyle w:val="BodyText"/>
       </w:pPr>
       <w:r>
-        <w:t xml:space="preserve">CGEM, developed at the FAA’s Civil Aerospace Medical Institute, is the reference regulatory model of +Gz physiology [7]. It solves a system of ordinary differential equations governing cardiovascular and cerebrovascular response under sustained +Gz load, producing time-series predictions for cerebral blood flow (c_bank), head-level arterial pressure (HLAP), visual function, and brain oxygenation [7,8]. The model has been validated against human centrifuge data at the FAA CAMI and underpins G-tolerance standards in civil aviation certification; preserving it byte-for-byte is therefore both a scientific and a regulatory requirement.</w:t>
+        <w:t xml:space="preserve">CGEM, developed at the FAA’s Civil Aerospace Medical Institute, is the reference regulatory model of +Gz physiology [7]. It solves a system of ordinary differential equations governing cardiovascular and cerebrovascular response under sustained +Gz load, producing time-series predictions for cerebral blood flow (c_bank), head-level arterial pressure (HLAP), visual function, and brain oxygenation [7,8]. Validation against human centrifuge data at the FAA CAMI established the model’s accuracy, and CGEM now underpins G-tolerance standards in civil-aviation certification — so preserving it byte-for-byte is both a scientific and a regulatory requirement.</w:t>
       </w:r>
     </w:p>
     <w:p>
@@ -242,7 +255,7 @@
         <w:pStyle w:val="BodyText"/>
       </w:pPr>
       <w:r>
-        <w:t xml:space="preserve">However, CGEM has three limitations that constrain its operational and research utility.</w:t>
+        <w:t xml:space="preserve">However, CGEM has three limits that constrain operational and research use.</w:t>
       </w:r>
       <w:r>
         <w:t xml:space="preserve"> </w:t>
@@ -258,7 +271,7 @@
         <w:t xml:space="preserve"> </w:t>
       </w:r>
       <w:r>
-        <w:t xml:space="preserve">Each CGEM invocation requires spawning a Fortran subprocess, writing a GLOC input deck to disk, waiting for the binary to solve the physiological ODE system, and parsing its output deck. On a modern multi-core CPU this takes approximately 9 ms per row — fast for single queries but prohibitive for parametric exploration: a 10,000-sample Saltelli Sobol study would require days of wall-clock time.</w:t>
+        <w:t xml:space="preserve">Each invocation spawns a Fortran subprocess, writes a GLOC input deck to disk, waits for the binary to solve the physiological ODE system, and parses its output deck. On a modern multi-core CPU this takes ~9 ms per row — fast for single queries but prohibitive for parametric exploration; a 10,000-sample Saltelli Sobol study would require days of wall-clock time.</w:t>
       </w:r>
       <w:r>
         <w:t xml:space="preserve"> </w:t>
@@ -274,7 +287,7 @@
         <w:t xml:space="preserve"> </w:t>
       </w:r>
       <w:r>
-        <w:t xml:space="preserve">CGEM produces a deterministic scalar (e.g.,</w:t>
+        <w:t xml:space="preserve">CGEM returns a deterministic scalar (e.g.,</w:t>
       </w:r>
       <w:r>
         <w:t xml:space="preserve"> </w:t>
@@ -305,7 +318,7 @@
         <w:t xml:space="preserve"> </w:t>
       </w:r>
       <w:r>
-        <w:t xml:space="preserve">Users can query CGEM with inputs far outside the training/validation envelope — a pilot configuration never tested, a G-onset profile beyond published data — and receive a number with no warning that the model is extrapolating.</w:t>
+        <w:t xml:space="preserve">Users can query CGEM with inputs far outside the training and validation envelope — a pilot configuration never tested, a G-onset profile beyond published data — and receive a number with no warning that the model is extrapolating.</w:t>
       </w:r>
     </w:p>
     <w:p>
@@ -313,7 +326,7 @@
         <w:pStyle w:val="BodyText"/>
       </w:pPr>
       <w:r>
-        <w:t xml:space="preserve">We address these three gaps with an additive ML extension layer that (1) detects out-of-distribution (OOD) inputs via robust Mahalanobis distance with distribution-free conformal abstention, (2) provides calibrated prediction intervals using a Mondrian-stratified homoscedastic split-conformal layer where appropriate and a heteroscedastic Conformalized Quantile Regression (CQR) layer for the long-tailed</w:t>
+        <w:t xml:space="preserve">We close those three gaps with an additive ML extension layer that (1) detects out-of-distribution (OOD) inputs via robust Mahalanobis distance with distribution-free conformal abstention, (2) provides calibrated prediction intervals — a Mondrian-stratified homoscedastic split-conformal layer where appropriate, and a heteroscedastic Conformalized Quantile Regression (CQR) layer for the long-tailed</w:t>
       </w:r>
       <w:r>
         <w:t xml:space="preserve"> </w:t>
@@ -328,7 +341,7 @@
         <w:t xml:space="preserve"> </w:t>
       </w:r>
       <w:r>
-        <w:t xml:space="preserve">target, (3) emulates CGEM at ~50 µs per row vs ~9 ms for direct subprocess invocation, and (4) identifies which input features drive G-LOC risk most via global sensitivity analysis (Sobol first- and total-order indices, Morris elementary effects). The framework is</w:t>
+        <w:t xml:space="preserve">target, (3) emulates CGEM at ~50 µs per row versus ~9 ms for direct subprocess invocation, and (4) ranks which input features drive G-LOC risk via global sensitivity analysis (Sobol first- and total-order indices, Morris elementary effects). The framework is</w:t>
       </w:r>
       <w:r>
         <w:t xml:space="preserve"> </w:t>
@@ -353,7 +366,7 @@
         <w:t xml:space="preserve"> </w:t>
       </w:r>
       <w:r>
-        <w:t xml:space="preserve">files), and input/output deck formats are not modified. The ML layer wraps the validated core like a fitted response surface; the authoritative</w:t>
+        <w:t xml:space="preserve">files), and input/output deck formats are not modified. The ML layer wraps the validated core like a fitted response surface, and the authoritative</w:t>
       </w:r>
       <w:r>
         <w:t xml:space="preserve"> </w:t>
@@ -368,7 +381,7 @@
         <w:t xml:space="preserve"> </w:t>
       </w:r>
       <w:r>
-        <w:t xml:space="preserve">endpoint remains available when direct CGEM invocation is required.</w:t>
+        <w:t xml:space="preserve">endpoint remains available when direct CGEM invocation is needed.</w:t>
       </w:r>
     </w:p>
     <w:p>
@@ -376,7 +389,7 @@
         <w:pStyle w:val="BodyText"/>
       </w:pPr>
       <w:r>
-        <w:t xml:space="preserve">The manuscript validates the framework against CGEM as ground truth — a synthetic-only validation strategy, declared explicitly, that establishes the emulator + OOD + sensitivity pipeline on known ground truth before any real centrifuge data enters the picture. External validation against archival centrifuge data and own-centrifuge subjects are subjects of separate work and are not claimed here. The validation protocol is pre-registered on the Open Science Framework (OSF); the search spaces, split indices, and success thresholds are frozen at OSF posting time.</w:t>
+        <w:t xml:space="preserve">This manuscript validates the framework against CGEM as ground truth. The synthetic-only strategy is declared explicitly: it establishes the emulator + OOD + sensitivity pipeline on known ground truth before any real centrifuge data enters the picture. External validation against archival centrifuge data and against own-centrifuge subjects is the subject of separate work and is not claimed here. The full validation protocol is pre-registered on the Open Science Framework (OSF); search spaces, split indices, and success thresholds are frozen at OSF posting time.</w:t>
       </w:r>
     </w:p>
     <w:p>
@@ -483,7 +496,7 @@
         <w:pStyle w:val="BodyText"/>
       </w:pPr>
       <w:r>
-        <w:t xml:space="preserve">The Fortran binary was compiled from the original CAMI source (</w:t>
+        <w:t xml:space="preserve">We compiled the Fortran binary from the original CAMI source (</w:t>
       </w:r>
       <w:r>
         <w:rPr>
@@ -495,7 +508,7 @@
         <w:t xml:space="preserve"> </w:t>
       </w:r>
       <w:r>
-        <w:t xml:space="preserve">files) and verified by reproducing a canonical FAA test case (Profile 4, standard 7-G sustained turn). The compiled binary’s SHA-256 hash is recorded in</w:t>
+        <w:t xml:space="preserve">files) and verified it by reproducing a canonical FAA test case (Profile 4, standard 7-G sustained turn). The compiled binary’s SHA-256 hash is recorded in</w:t>
       </w:r>
       <w:r>
         <w:t xml:space="preserve"> </w:t>
@@ -520,7 +533,7 @@
           <w:bCs/>
           <w:b/>
         </w:rPr>
-        <w:t xml:space="preserve">The Fortran binary is not modified by the present work; the ML extension layer wraps it as a black-box function.</w:t>
+        <w:t xml:space="preserve">The present work does not modify the Fortran binary; the ML extension layer wraps it as a black-box function.</w:t>
       </w:r>
     </w:p>
     <w:bookmarkEnd w:id="22"/>
@@ -538,7 +551,7 @@
         <w:pStyle w:val="FirstParagraph"/>
       </w:pPr>
       <w:r>
-        <w:t xml:space="preserve">A structured synthetic dataset (</w:t>
+        <w:t xml:space="preserve">We generated a structured synthetic dataset (</w:t>
       </w:r>
       <w:r>
         <w:rPr>
@@ -547,7 +560,7 @@
         <w:t xml:space="preserve">cgem_synthetic_v1</w:t>
       </w:r>
       <w:r>
-        <w:t xml:space="preserve">) was generated by enumerating a cross-product input grid and invoking CGEM once per (maneuver, pilot configuration) pair.</w:t>
+        <w:t xml:space="preserve">) by enumerating a cross-product input grid and invoking CGEM once per (maneuver, pilot configuration) pair.</w:t>
       </w:r>
     </w:p>
     <w:p>
@@ -915,7 +928,7 @@
         <w:pStyle w:val="FirstParagraph"/>
       </w:pPr>
       <w:r>
-        <w:t xml:space="preserve">Rows were split 70/15/15 (train/validation/test) stratified by</w:t>
+        <w:t xml:space="preserve">We split rows 70/15/15 (train/validation/test) stratified by</w:t>
       </w:r>
       <w:r>
         <w:t xml:space="preserve"> </w:t>
@@ -930,7 +943,7 @@
         <w:t xml:space="preserve"> </w:t>
       </w:r>
       <w:r>
-        <w:t xml:space="preserve">(master seed 42), implemented in</w:t>
+        <w:t xml:space="preserve">(master seed 42); the splitter is</w:t>
       </w:r>
       <w:r>
         <w:t xml:space="preserve"> </w:t>
@@ -1079,10 +1092,7 @@
         <w:t xml:space="preserve">successor framework</w:t>
       </w:r>
       <w:r>
-        <w:t xml:space="preserve"> </w:t>
-      </w:r>
-      <w:r>
-        <w:t xml:space="preserve">but not the present implementation — is conformalized survival analysis: distribution-free finite-sample lower predictive bounds on event time, calibrated under Type-I right-censoring (Candès, Lei &amp; Ren [24]), with adaptive cut-offs for more informative bounds (Gui, Hannig &amp; Hofmann [25]), and a general-right-censored extension applicable when censoring time is not always observed (Davidov, Feldman, Shamai, Kimmel &amp; Romano [26]). The present manuscript reports the two-stage classifier + heteroscedastic CQR-conformal regressor implementation already validated against the OSF-pre-registered protocol; replacement with conformalized survival is paper-2 scope and is justified in §4.6.</w:t>
+        <w:t xml:space="preserve">, not the present implementation — is conformalized survival analysis: distribution-free finite-sample lower predictive bounds on event time, calibrated under Type-I right-censoring (Candès, Lei &amp; Ren [24]), with adaptive cut-offs for tighter bounds (Gui, Hannig &amp; Hofmann [25]), and a general-right-censored extension for when censoring time is not always observed (Davidov, Feldman, Shamai, Kimmel &amp; Romano [26]). This manuscript reports the two-stage classifier + heteroscedastic CQR-conformal regressor implementation already validated against the OSF-pre-registered protocol; replacing it with conformalized survival is paper-2 scope and is justified in §4.6.</w:t>
       </w:r>
     </w:p>
     <w:p>
@@ -1528,7 +1538,7 @@
         <w:t xml:space="preserve">[q̂_lo(x) − q̂_s, q̂_hi(x) + q̂_s]</w:t>
       </w:r>
       <w:r>
-        <w:t xml:space="preserve">. Bracket width is allowed to vary with x — that is the advantage over the homoscedastic Mondrian baseline for</w:t>
+        <w:t xml:space="preserve">. Bracket width varies with x — the advantage over the homoscedastic Mondrian baseline for</w:t>
       </w:r>
       <w:r>
         <w:t xml:space="preserve"> </w:t>
@@ -1978,7 +1988,7 @@
         <w:t xml:space="preserve"> </w:t>
       </w:r>
       <w:r>
-        <w:t xml:space="preserve">as the operational threshold. The conformal layer is precisely the mechanism that compensates empirically for this misspecification: it replaces the parametric distributional assumption with an exchangeability-based finite-sample guarantee.</w:t>
+        <w:t xml:space="preserve">as the operational threshold. The conformal layer compensates empirically for this misspecification by replacing the parametric distributional assumption with an exchangeability-based finite-sample guarantee.</w:t>
       </w:r>
     </w:p>
     <w:p>
@@ -2206,7 +2216,7 @@
         <w:t xml:space="preserve">N</w:t>
       </w:r>
       <w:r>
-        <w:t xml:space="preserve">(2D + 2) = 20,480 model evaluations) was performed with the surrogate emulator as the evaluation function. First-order (S₁), total-order (ST), and second-order (S₂) indices were computed via</w:t>
+        <w:t xml:space="preserve">(2D + 2) = 20,480 model evaluations) used the surrogate emulator as the evaluation function. We computed first-order (S₁), total-order (ST), and second-order (S₂) indices via</w:t>
       </w:r>
       <w:r>
         <w:t xml:space="preserve"> </w:t>
@@ -2221,7 +2231,7 @@
         <w:t xml:space="preserve"> </w:t>
       </w:r>
       <w:r>
-        <w:t xml:space="preserve">with 95 % bootstrap confidence intervals. S₁ captures the fraction of output variance attributable to a single input alone; ST captures the total contribution including all interaction effects of any order.</w:t>
+        <w:t xml:space="preserve">with 95 % bootstrap confidence intervals. S₁ captures the fraction of output variance attributable to a single input alone; ST captures the total contribution, including all interaction effects of any order.</w:t>
       </w:r>
     </w:p>
     <w:p>
@@ -2239,7 +2249,7 @@
         <w:t xml:space="preserve"> </w:t>
       </w:r>
       <w:r>
-        <w:t xml:space="preserve">As a complementary screening method, Morris one-at-a-time trajectories were computed (</w:t>
+        <w:t xml:space="preserve">As a complementary screen, we computed Morris one-at-a-time trajectories (</w:t>
       </w:r>
       <w:r>
         <w:rPr>
@@ -2268,7 +2278,7 @@
         <w:t xml:space="preserve"> </w:t>
       </w:r>
       <w:r>
-        <w:t xml:space="preserve">= 100 trajectories, yielding 1,000 model evaluations per target). The μ* metric (mean absolute elementary effect) ranks inputs by their average local sensitivity; σ (standard deviation of elementary effects) flags inputs with nonlinear or interaction-driven effects.</w:t>
+        <w:t xml:space="preserve">= 100 trajectories, yielding 1,000 model evaluations per target). The μ* metric (mean absolute elementary effect) ranks inputs by average local sensitivity; σ (standard deviation of elementary effects) flags inputs with nonlinear or interaction-driven effects.</w:t>
       </w:r>
     </w:p>
     <w:p>
@@ -3153,7 +3163,7 @@
         <w:t xml:space="preserve">E</w:t>
       </w:r>
       <w:r>
-        <w:t xml:space="preserve">[time | event] is heavily damped on these high-event-rate test rows. The XGBoost monotonicity-constrained two-stage approach is not subject to this damping. RF baseline numbers are reported as supplementary rather than in the main table to avoid drawing attention to a comparison that the architecture, not the algorithm, makes unfair.</w:t>
+        <w:t xml:space="preserve">[time | event] is heavily damped on these high-event-rate test rows. The XGBoost monotonicity-constrained two-stage approach avoids this damping. We report RF baseline numbers as supplementary rather than in the main table because the architecture, not the algorithm, makes the comparison unfair.</w:t>
       </w:r>
     </w:p>
     <w:p>
@@ -3189,7 +3199,7 @@
         <w:t xml:space="preserve"> </w:t>
       </w:r>
       <w:r>
-        <w:t xml:space="preserve">Direct CGEM subprocess invocation takes ~9 ms per row (wall-clock, single core); XGBoost surrogate point prediction takes ~50 µs per row in-process — a ~180× wall-clock acceleration. Latency is reported here as a deployment characteristic, not as a methodological novelty: the methodological contributions of this work are the calibrated heteroscedastic conformal layer for the long-tailed</w:t>
+        <w:t xml:space="preserve">Direct CGEM subprocess invocation takes ~9 ms per row (wall-clock, single core); XGBoost surrogate point prediction takes ~50 µs per row in-process — a ~180× wall-clock acceleration. We report latency here as a deployment characteristic, not as a methodological novelty: the methodological contributions of this work are the calibrated heteroscedastic conformal layer for the long-tailed</w:t>
       </w:r>
       <w:r>
         <w:t xml:space="preserve"> </w:t>
@@ -3204,7 +3214,7 @@
         <w:t xml:space="preserve"> </w:t>
       </w:r>
       <w:r>
-        <w:t xml:space="preserve">target, the maneuver-category Mondrian stratification, the distribution-free conformal OOD abstention, and the surrogate-driven global sensitivity decomposition. The latency anchor is what makes those contributions tractable inside a manuscript-preparation cycle — most directly, it lets the 20,480-evaluation Saltelli Sobol sweep used in §3.6 complete in under one second rather than the ~3 minutes that direct CGEM invocations would require — and it is presented as such in the abstract, the highlights, and the graphical abstract.</w:t>
+        <w:t xml:space="preserve">target, the maneuver-category Mondrian stratification, the distribution-free conformal OOD abstention, and the surrogate-driven global sensitivity decomposition. The latency anchor is what makes those contributions tractable inside a manuscript-preparation cycle — most directly, it lets the 20,480-evaluation Saltelli Sobol sweep used in §3.6 complete in under one second rather than the ~3 minutes that direct CGEM invocations would require — and it is framed that way in the abstract, the highlights, and the graphical abstract.</w:t>
       </w:r>
     </w:p>
     <w:bookmarkEnd w:id="32"/>
@@ -4779,7 +4789,7 @@
         <w:t xml:space="preserve"> </w:t>
       </w:r>
       <w:r>
-        <w:t xml:space="preserve">achieves an empirical in-envelope rate of</w:t>
+        <w:t xml:space="preserve">reaches an empirical in-envelope rate of</w:t>
       </w:r>
       <w:r>
         <w:t xml:space="preserve"> </w:t>
@@ -4795,7 +4805,7 @@
         <w:t xml:space="preserve"> </w:t>
       </w:r>
       <w:r>
-        <w:t xml:space="preserve">on the held-out test split, within ±0.3 pp of the nominal 95 %. The conformal threshold (78.3 squared distance units) is approximately 3× the parametric χ²(17, 0.95) cutoff (27.6), confirming that the joint feature distribution is substantially heavier-tailed than multivariate Gaussian. The χ² threshold alone would flag 37.2 % of in-distribution test rows as OOD — an unacceptably high false-positive rate. The conformal layer corrects this cleanly.</w:t>
+        <w:t xml:space="preserve">on the held-out test split, within ±0.3 pp of the nominal 95 %. Its threshold (78.3 squared distance units) sits at approximately 3× the parametric χ²(17, 0.95) cutoff (27.6), which confirms that the joint feature distribution is substantially heavier-tailed than multivariate Gaussian. By contrast, the χ² threshold alone would flag 37.2 % of in-distribution test rows as OOD — an unacceptably high false-positive rate. The conformal layer corrects this cleanly.</w:t>
       </w:r>
     </w:p>
     <w:p>
@@ -6840,7 +6850,7 @@
         <w:pStyle w:val="BodyText"/>
       </w:pPr>
       <w:r>
-        <w:t xml:space="preserve">The emulator’s performance is satisfactory for all targets: classification of event occurrence is near-perfect (AUROC ≥ 0.996), continuous-target regression is excellent (R² = 0.94–1.00), and censored-target regression on event-positive rows is good (R² = 0.82–0.90). The weakest target is</w:t>
+        <w:t xml:space="preserve">Emulator performance is satisfactory across all targets: event-occurrence classification is near-perfect (AUROC ≥ 0.996), continuous-target regression is excellent (R² = 0.94–1.00), and censored-target regression on event-positive rows is good (R² = 0.82–0.90). The weakest target is</w:t>
       </w:r>
       <w:r>
         <w:t xml:space="preserve"> </w:t>
@@ -6855,7 +6865,7 @@
         <w:t xml:space="preserve"> </w:t>
       </w:r>
       <w:r>
-        <w:t xml:space="preserve">(R² = 0.821, RMSE = 1.14 s), consistent with it being the most extreme censored event; its Mondrian conformal interval also shows under-coverage (0.861). An error of ±1.14 s on a G-LOC time prediction can be operationally significant — the conformal interval width communicates this uncertainty to the user explicitly.</w:t>
+        <w:t xml:space="preserve">(R² = 0.821, RMSE = 1.14 s), as expected for the most extreme censored event; its Mondrian conformal interval also under-covers (0.861). An error of ±1.14 s on a G-LOC time prediction can be operationally significant — the conformal interval width communicates that uncertainty to the user explicitly.</w:t>
       </w:r>
     </w:p>
     <w:bookmarkEnd w:id="39"/>
@@ -6957,7 +6967,7 @@
         <w:pStyle w:val="FirstParagraph"/>
       </w:pPr>
       <w:r>
-        <w:t xml:space="preserve">CGEM and its predecessor cardiovascular models have been used in FAA technical reports and aeromedical publications for point-estimate G-tolerance prediction [5-8]. None of these prior applications provided (a) conformal prediction intervals, (b) OOD input guardrails, or (c) global sensitivity rankings. The present work is, to our knowledge, the first published ML-based surrogate emulator of CGEM.</w:t>
+        <w:t xml:space="preserve">CGEM and its predecessor cardiovascular models have served FAA technical reports and aeromedical publications for point-estimate G-tolerance prediction [5–8]. None of those prior applications provided (a) conformal prediction intervals, (b) OOD input guardrails, or (c) global sensitivity rankings. To our knowledge, this is the first published ML-based surrogate emulator of CGEM.</w:t>
       </w:r>
     </w:p>
     <w:p>
@@ -6965,7 +6975,7 @@
         <w:pStyle w:val="BodyText"/>
       </w:pPr>
       <w:r>
-        <w:t xml:space="preserve">Recent work on physiological surrogates of cardiovascular and cardiopulmonary models has demonstrated the utility of fast emulation paired with calibrated uncertainty quantification in adjacent biomedical domains [14,19,20]. Kakhaia et al. [20] developed an inverse uncertainty quantification framework for a mechanical model of arterial tissue using surrogate modelling — directly the methodological neighbourhood of the present work. The numerical-methods foundation for one-dimensional arterial-flow modelling, on which much computational cardiovascular surrogate work builds, was systematically benchmarked at IJNMBE by Boileau et al. [21]. Most directly relevant, Portela, Banga &amp; Matabuena [23] applied distribution-free conformal prediction to dynamic biological ODE systems in a 2025</w:t>
+        <w:t xml:space="preserve">Recent work on physiological surrogates of cardiovascular and cardiopulmonary models has shown that fast emulation paired with calibrated uncertainty quantification works well in adjacent biomedical domains [14,19,20]. Kakhaia et al. [20] developed an inverse uncertainty quantification framework for a mechanical model of arterial tissue using surrogate modelling — directly the methodological neighbourhood of the present work. The numerical-methods foundation for one-dimensional arterial-flow modelling, on which much computational cardiovascular surrogate work builds, was systematically benchmarked at IJNMBE by Boileau et al. [21]. Most directly relevant, Portela, Banga &amp; Matabuena [23] applied distribution-free conformal prediction to dynamic biological ODE systems in a 2025</w:t>
       </w:r>
       <w:r>
         <w:t xml:space="preserve"> </w:t>
@@ -7024,7 +7034,7 @@
         <w:t xml:space="preserve"> </w:t>
       </w:r>
       <w:r>
-        <w:t xml:space="preserve">Sections 3.2–3.6 validate the framework against CGEM-as-ground-truth — the surrogate’s R² and the conformal layer’s coverage measure how well the ML layer reproduces CGEM, not how well CGEM predicts real outcomes. Section 3.7 partially closes this gap by evaluating the calibrated surrogate against the Phase A archival cohort (n = 8 pooled mean ± SD records from Whinnery &amp; Forster 2013 [5]; n_parent = 729 relaxed-subject centrifuge participants — the commonly cited n = 888 total in W&amp;F2013 includes with-AGSM records excluded from the OSF H6 mapping, as explained in §3.7) and reports the discrepancy δ̄ = +26.6 s [95 % CI +6.3, +52.1] with an explicit slow-onset bias. Phase B per-subject extraction and validation against own-centrifuge subjects are subjects of separate work and are not claimed in this manuscript.</w:t>
+        <w:t xml:space="preserve">Sections 3.2–3.6 validate the framework against CGEM-as-ground-truth — the surrogate’s R² and the conformal layer’s coverage measure how well the ML layer reproduces CGEM, not how well CGEM predicts real outcomes. Section 3.7 partially closes this gap by evaluating the calibrated surrogate against the Phase A archival cohort (n = 8 pooled mean ± SD records from Whinnery &amp; Forster 2013 [5]; n_parent = 729 relaxed-subject centrifuge participants — the commonly cited n = 888 total in W&amp;F2013 includes with-AGSM records excluded from the OSF H6 mapping, as explained in §3.7) and reports the discrepancy δ̄ = +26.6 s [95 % CI +6.3, +52.1] with an explicit slow-onset bias. Phase B per-subject extraction and validation against own-centrifuge subjects belong to separate work and are not claimed here.</w:t>
       </w:r>
     </w:p>
     <w:p>
@@ -7138,7 +7148,7 @@
         <w:t xml:space="preserve"> </w:t>
       </w:r>
       <w:r>
-        <w:t xml:space="preserve">The conformal threshold flags ~5 % of in-distribution queries. The abstention is conservative by design: flagging a well-supported input as OOD (false positive) is safer than the reverse. But a 5 % false-positive rate means, operationally, that 1 in 20 routine queries will show a warning — potentially eroding user trust if not well-communicated.</w:t>
+        <w:t xml:space="preserve">The conformal threshold flags ~5 % of in-distribution queries. By design, the abstention is conservative: flagging a well-supported input as OOD (false positive) is safer than the reverse. But a 5 % false-positive rate means, operationally, that 1 in 20 routine queries will show a warning — and that erodes user trust unless it is well-communicated.</w:t>
       </w:r>
     </w:p>
     <w:p>
@@ -7651,7 +7661,7 @@
         <w:pStyle w:val="FirstParagraph"/>
       </w:pPr>
       <w:r>
-        <w:t xml:space="preserve">This framework preserves a validated FAA physiological model while augmenting it with fast emulation, calibrated uncertainty quantification for four of five targets (with a heteroscedastic CQR layer activated for the long-tailed</w:t>
+        <w:t xml:space="preserve">This framework preserves a validated FAA physiological model and adds fast emulation, calibrated uncertainty quantification for four of five targets (with a heteroscedastic CQR layer activated for the long-tailed</w:t>
       </w:r>
       <w:r>
         <w:t xml:space="preserve"> </w:t>
@@ -7666,7 +7676,7 @@
         <w:t xml:space="preserve"> </w:t>
       </w:r>
       <w:r>
-        <w:t xml:space="preserve">target, where the homoscedastic Mondrian baseline under-covered and where the regressor’s event-positive R² has a 95 % bootstrap CI lower bound of −0.055), input-envelope guardrails, and global sensitivity analysis — a methodological contribution that requires no claim of novel physiology. The H6 archival evaluation bounds applicability to the rapid-onset (≥ 1 G/s) regime operationally relevant to fighter and aerobatic flight; the slow-onset bias of δ̄ = +26.6 s [95 % CI +6.3, +52.1] is documented as a CGEM-vs-reality discrepancy term to be addressed in paper 2. The pipeline is open, reproducible, pre-registered, and designed to absorb progressively stronger external validation in papers 2 and 3 without architectural changes. It is ready for downstream aeromedical research applications: parametric mission planning, real-time G-LOC risk advisory prototyping, and as the computational backbone for future Bayesian per-pilot calibration studies.</w:t>
+        <w:t xml:space="preserve">target, where the homoscedastic Mondrian baseline under-covered and where the regressor’s event-positive R² has a 95 % bootstrap CI lower bound of −0.055), input-envelope guardrails, and global sensitivity analysis — a methodological contribution that requires no claim of novel physiology. The H6 archival evaluation bounds applicability to the rapid-onset (≥ 1 G/s) regime operationally relevant to fighter and aerobatic flight; the slow-onset bias of δ̄ = +26.6 s [95 % CI +6.3, +52.1] is documented as a CGEM-vs-reality discrepancy term to be addressed in paper 2. Open, reproducible, and pre-registered, the pipeline is designed to absorb progressively stronger external validation in papers 2 and 3 without architectural changes. It is ready for downstream aeromedical research applications: parametric mission planning, real-time G-LOC risk advisory prototyping, and the computational backbone for future Bayesian per-pilot calibration studies.</w:t>
       </w:r>
     </w:p>
     <w:p>

</xml_diff>